<commit_message>
Pasar justificacion y detalle de gastos a US$ 27,000 hasta fin de 2026
Co-Authored-By: Claude Opus 5.5 <noreply@anthropic.com>
Claude-Session: https://claude.ai/code/session_01DoHx9ZQNZXcgog7oJGoyRL
</commit_message>
<xml_diff>
--- a/JUSTIFICACION_OC_DESERCION_VEHICULAR.docx
+++ b/JUSTIFICACION_OC_DESERCION_VEHICULAR.docx
@@ -50,76 +50,6 @@
           <w:iCs/>
           <w:color w:val="000000" w:themeColor="text1"/>
         </w:rPr>
-        <w:t xml:space="preserve">TIPO DE SOLICITUD: </w:t>
-      </w:r>
-      <w:r>
-        <w:rPr>
-          <w:rFonts w:ascii="Times New Roman" w:eastAsia="Times New Roman" w:hAnsi="Times New Roman" w:cs="Times New Roman"/>
-          <w:i/>
-          <w:iCs/>
-          <w:color w:val="000000" w:themeColor="text1"/>
-        </w:rPr>
-        <w:t xml:space="preserve">Ampliación de monto de Orden de Compra N° </w:t>
-      </w:r>
-      <w:r>
-        <w:rPr>
-          <w:rFonts w:ascii="Times New Roman" w:eastAsia="Times New Roman" w:hAnsi="Times New Roman" w:cs="Times New Roman"/>
-          <w:i/>
-          <w:iCs/>
-          <w:color w:val="000000" w:themeColor="text1"/>
-          <w:highlight w:val="yellow"/>
-        </w:rPr>
-        <w:t xml:space="preserve">[N° OC VIGENTE]</w:t>
-      </w:r>
-    </w:p>
-    <w:p>
-      <w:pPr>
-        <w:spacing w:before="100" w:after="240" w:line="240" w:lineRule="auto"/>
-        <w:ind w:left="3540"/>
-        <w:rPr>
-          <w:rFonts w:ascii="Times New Roman" w:eastAsia="Times New Roman" w:hAnsi="Times New Roman" w:cs="Times New Roman"/>
-          <w:color w:val="000000" w:themeColor="text1"/>
-        </w:rPr>
-      </w:pPr>
-      <w:r>
-        <w:rPr>
-          <w:rFonts w:ascii="Times New Roman" w:eastAsia="Times New Roman" w:hAnsi="Times New Roman" w:cs="Times New Roman"/>
-          <w:b/>
-          <w:bCs/>
-          <w:i/>
-          <w:iCs/>
-          <w:color w:val="000000" w:themeColor="text1"/>
-        </w:rPr>
-        <w:t xml:space="preserve">MODALIDAD SELECCIÓN: </w:t>
-      </w:r>
-      <w:r>
-        <w:rPr>
-          <w:rFonts w:ascii="Times New Roman" w:eastAsia="Times New Roman" w:hAnsi="Times New Roman" w:cs="Times New Roman"/>
-          <w:i/>
-          <w:iCs/>
-          <w:color w:val="000000" w:themeColor="text1"/>
-        </w:rPr>
-        <w:t xml:space="preserve">SOLICITUD DE OFERTA DIRECTA D – SOD D</w:t>
-      </w:r>
-    </w:p>
-    <w:p>
-      <w:pPr>
-        <w:spacing w:before="100" w:after="240" w:line="240" w:lineRule="auto"/>
-        <w:ind w:left="3540"/>
-        <w:rPr>
-          <w:rFonts w:ascii="Times New Roman" w:eastAsia="Times New Roman" w:hAnsi="Times New Roman" w:cs="Times New Roman"/>
-          <w:color w:val="000000" w:themeColor="text1"/>
-        </w:rPr>
-      </w:pPr>
-      <w:r>
-        <w:rPr>
-          <w:rFonts w:ascii="Times New Roman" w:eastAsia="Times New Roman" w:hAnsi="Times New Roman" w:cs="Times New Roman"/>
-          <w:b/>
-          <w:bCs/>
-          <w:i/>
-          <w:iCs/>
-          <w:color w:val="000000" w:themeColor="text1"/>
-        </w:rPr>
         <w:t xml:space="preserve">JUSTIFICACIÓN DE LA SOLICITUD:</w:t>
       </w:r>
     </w:p>
@@ -137,7 +67,7 @@
           <w:rFonts w:ascii="Times New Roman" w:eastAsia="Times New Roman" w:hAnsi="Times New Roman" w:cs="Times New Roman"/>
           <w:color w:val="000000" w:themeColor="text1"/>
         </w:rPr>
-        <w:t xml:space="preserve">Se solicita la ampliación del monto de la orden de compra vigente con </w:t>
+        <w:t xml:space="preserve">Se solicita la ampliación del monto de la orden de compra con </w:t>
       </w:r>
       <w:r>
         <w:rPr>
@@ -153,24 +83,24 @@
           <w:rFonts w:ascii="Times New Roman" w:eastAsia="Times New Roman" w:hAnsi="Times New Roman" w:cs="Times New Roman"/>
           <w:color w:val="000000" w:themeColor="text1"/>
         </w:rPr>
-        <w:t xml:space="preserve"> por S/ 27,000.00 + IGV, para cubrir el servicio integral de gestión y ejecución de la iniciativa de deserción vehicular de Cálidda durante los próximos dos meses y medio (75 días).</w:t>
-      </w:r>
-    </w:p>
-    <w:p>
-      <w:pPr>
-        <w:spacing w:before="100" w:after="240" w:line="240" w:lineRule="auto"/>
-        <w:ind w:left="3540"/>
-        <w:rPr>
-          <w:rFonts w:ascii="Times New Roman" w:eastAsia="Times New Roman" w:hAnsi="Times New Roman" w:cs="Times New Roman"/>
-          <w:color w:val="000000" w:themeColor="text1"/>
-        </w:rPr>
-      </w:pPr>
-      <w:r>
-        <w:rPr>
-          <w:rFonts w:ascii="Times New Roman" w:eastAsia="Times New Roman" w:hAnsi="Times New Roman" w:cs="Times New Roman"/>
-          <w:color w:val="000000" w:themeColor="text1"/>
-        </w:rPr>
-        <w:t xml:space="preserve">La iniciativa tiene como objetivo captar y registrar 5,000 conductores, y comprende tres componentes: (1) plataforma de registros y chatbot de atención, (2) volanteo en campo y (3) marketing digital para la captación de registros. El monto solicitado es un tope: el gasto se ejecutará en función de los registros efectivamente obtenidos.</w:t>
+        <w:t xml:space="preserve"> por US$ 27,000.00 + IGV, para cubrir los gastos de la iniciativa de deserción vehicular de Cálidda hasta el cierre del año 2026.</w:t>
+      </w:r>
+    </w:p>
+    <w:p>
+      <w:pPr>
+        <w:spacing w:before="100" w:after="240" w:line="240" w:lineRule="auto"/>
+        <w:ind w:left="3540"/>
+        <w:rPr>
+          <w:rFonts w:ascii="Times New Roman" w:eastAsia="Times New Roman" w:hAnsi="Times New Roman" w:cs="Times New Roman"/>
+          <w:color w:val="000000" w:themeColor="text1"/>
+        </w:rPr>
+      </w:pPr>
+      <w:r>
+        <w:rPr>
+          <w:rFonts w:ascii="Times New Roman" w:eastAsia="Times New Roman" w:hAnsi="Times New Roman" w:cs="Times New Roman"/>
+          <w:color w:val="000000" w:themeColor="text1"/>
+        </w:rPr>
+        <w:t xml:space="preserve">La iniciativa se encuentra en proceso de escalamiento y pasará a su siguiente fase, por lo que se requiere asegurar el presupuesto para su ejecución. El monto cubre, de manera general, los tres gastos de la iniciativa: la plataforma de registros (10,000 registros), el marketing digital y el volanteo en campo. El monto de US$ 27,000.00 es el tope de la ampliación.</w:t>
       </w:r>
     </w:p>
     <w:p>
@@ -224,28 +154,28 @@
           <w:rFonts w:ascii="Times New Roman" w:eastAsia="Times New Roman" w:hAnsi="Times New Roman" w:cs="Times New Roman"/>
           <w:color w:val="000000" w:themeColor="text1"/>
         </w:rPr>
-        <w:t xml:space="preserve"> cuenta con una orden de compra vigente con Cálidda y es el responsable de la ejecución integral de la iniciativa. Gestiona y coordina, a través de aliados especializados, los tres componentes del servicio, de modo que Cálidda cuenta con una sola contraparte, una sola facturación y un único responsable del cumplimiento. Ampliar la orden vigente da continuidad a la iniciativa sin interrumpir la operación en curso.</w:t>
-      </w:r>
-    </w:p>
-    <w:p>
-      <w:pPr>
-        <w:spacing w:before="100" w:after="240" w:line="240" w:lineRule="auto"/>
-        <w:ind w:left="3540"/>
-        <w:rPr>
-          <w:rFonts w:ascii="Times New Roman" w:eastAsia="Times New Roman" w:hAnsi="Times New Roman" w:cs="Times New Roman"/>
-          <w:color w:val="000000" w:themeColor="text1"/>
-        </w:rPr>
-      </w:pPr>
-      <w:r>
-        <w:rPr>
-          <w:rFonts w:ascii="Times New Roman" w:eastAsia="Times New Roman" w:hAnsi="Times New Roman" w:cs="Times New Roman"/>
-          <w:b/>
-          <w:bCs/>
-          <w:i/>
-          <w:iCs/>
-          <w:color w:val="000000" w:themeColor="text1"/>
-        </w:rPr>
-        <w:t xml:space="preserve">DETALLE DE GASTOS (75 días):</w:t>
+        <w:t xml:space="preserve"> cuenta con una orden de compra vigente con Cálidda y es el responsable de la ejecución integral de la iniciativa. Gestiona y coordina, a través de aliados especializados, los tres componentes del servicio, de modo que Cálidda cuenta con una sola contraparte, una sola facturación y un único responsable del cumplimiento.</w:t>
+      </w:r>
+    </w:p>
+    <w:p>
+      <w:pPr>
+        <w:spacing w:before="100" w:after="240" w:line="240" w:lineRule="auto"/>
+        <w:ind w:left="3540"/>
+        <w:rPr>
+          <w:rFonts w:ascii="Times New Roman" w:eastAsia="Times New Roman" w:hAnsi="Times New Roman" w:cs="Times New Roman"/>
+          <w:color w:val="000000" w:themeColor="text1"/>
+        </w:rPr>
+      </w:pPr>
+      <w:r>
+        <w:rPr>
+          <w:rFonts w:ascii="Times New Roman" w:eastAsia="Times New Roman" w:hAnsi="Times New Roman" w:cs="Times New Roman"/>
+          <w:b/>
+          <w:bCs/>
+          <w:i/>
+          <w:iCs/>
+          <w:color w:val="000000" w:themeColor="text1"/>
+        </w:rPr>
+        <w:t xml:space="preserve">DETALLE DE GASTOS (hasta el 31 de diciembre de 2026):</w:t>
       </w:r>
     </w:p>
     <w:p>
@@ -275,7 +205,7 @@
           <w:iCs/>
           <w:color w:val="000000" w:themeColor="text1"/>
         </w:rPr>
-        <w:t xml:space="preserve">5,000 registros × US$ 0.80 por registro (incluye las conversaciones del chatbot con el conductor) = US$ 4,000.00 ≈ S/ 13,600.00</w:t>
+        <w:t xml:space="preserve">10,000 registros × US$ 0.80 por registro (incluye las conversaciones del chatbot) = US$ 8,000.00</w:t>
       </w:r>
     </w:p>
     <w:p>
@@ -296,16 +226,16 @@
           <w:iCs/>
           <w:color w:val="000000" w:themeColor="text1"/>
         </w:rPr>
-        <w:t xml:space="preserve">2. Volanteo en campo: </w:t>
-      </w:r>
-      <w:r>
-        <w:rPr>
-          <w:rFonts w:ascii="Times New Roman" w:eastAsia="Times New Roman" w:hAnsi="Times New Roman" w:cs="Times New Roman"/>
-          <w:i/>
-          <w:iCs/>
-          <w:color w:val="000000" w:themeColor="text1"/>
-        </w:rPr>
-        <w:t xml:space="preserve">S/ 150 por día × 26 días al mes × 2.5 meses = S/ 9,750.00</w:t>
+        <w:t xml:space="preserve">2. Marketing digital: </w:t>
+      </w:r>
+      <w:r>
+        <w:rPr>
+          <w:rFonts w:ascii="Times New Roman" w:eastAsia="Times New Roman" w:hAnsi="Times New Roman" w:cs="Times New Roman"/>
+          <w:i/>
+          <w:iCs/>
+          <w:color w:val="000000" w:themeColor="text1"/>
+        </w:rPr>
+        <w:t xml:space="preserve">US$ 9,500.00</w:t>
       </w:r>
     </w:p>
     <w:p>
@@ -326,67 +256,67 @@
           <w:iCs/>
           <w:color w:val="000000" w:themeColor="text1"/>
         </w:rPr>
-        <w:t xml:space="preserve">3. Marketing digital: </w:t>
-      </w:r>
-      <w:r>
-        <w:rPr>
-          <w:rFonts w:ascii="Times New Roman" w:eastAsia="Times New Roman" w:hAnsi="Times New Roman" w:cs="Times New Roman"/>
-          <w:i/>
-          <w:iCs/>
-          <w:color w:val="000000" w:themeColor="text1"/>
-        </w:rPr>
-        <w:t xml:space="preserve">campañas digitales para la captación de registros = S/ 3,650.00</w:t>
-      </w:r>
-    </w:p>
-    <w:p>
-      <w:pPr>
-        <w:spacing w:before="100" w:after="240" w:line="240" w:lineRule="auto"/>
-        <w:ind w:left="3540"/>
-        <w:rPr>
-          <w:rFonts w:ascii="Times New Roman" w:eastAsia="Times New Roman" w:hAnsi="Times New Roman" w:cs="Times New Roman"/>
-          <w:color w:val="000000" w:themeColor="text1"/>
-        </w:rPr>
-      </w:pPr>
-      <w:r>
-        <w:rPr>
-          <w:rFonts w:ascii="Times New Roman" w:eastAsia="Times New Roman" w:hAnsi="Times New Roman" w:cs="Times New Roman"/>
-          <w:i/>
-          <w:iCs/>
-          <w:color w:val="000000" w:themeColor="text1"/>
-        </w:rPr>
-        <w:t xml:space="preserve">Tipo de cambio referencial: S/ 3.40 por US$. El detalle completo se adjunta en el Excel “detalle-gastos-desercion-vehicular.xlsx”.</w:t>
-      </w:r>
-    </w:p>
-    <w:p>
-      <w:pPr>
-        <w:spacing w:before="100" w:after="240" w:line="240" w:lineRule="auto"/>
-        <w:ind w:left="3540"/>
-        <w:rPr>
-          <w:rFonts w:ascii="Times New Roman" w:eastAsia="Times New Roman" w:hAnsi="Times New Roman" w:cs="Times New Roman"/>
-          <w:color w:val="000000" w:themeColor="text1"/>
-        </w:rPr>
-      </w:pPr>
-      <w:r>
-        <w:rPr>
-          <w:rFonts w:ascii="Times New Roman" w:eastAsia="Times New Roman" w:hAnsi="Times New Roman" w:cs="Times New Roman"/>
-          <w:b/>
-          <w:bCs/>
-          <w:i/>
-          <w:iCs/>
-          <w:color w:val="000000" w:themeColor="text1"/>
-        </w:rPr>
-        <w:t xml:space="preserve">MONTO TOTAL DE LA AMPLIACIÓN: </w:t>
-      </w:r>
-      <w:r>
-        <w:rPr>
-          <w:rFonts w:ascii="Times New Roman" w:eastAsia="Times New Roman" w:hAnsi="Times New Roman" w:cs="Times New Roman"/>
-          <w:b/>
-          <w:bCs/>
-          <w:i/>
-          <w:iCs/>
-          <w:color w:val="000000" w:themeColor="text1"/>
-        </w:rPr>
-        <w:t xml:space="preserve">S/ 27,000.00 + IGV</w:t>
+        <w:t xml:space="preserve">3. Volanteo en campo: </w:t>
+      </w:r>
+      <w:r>
+        <w:rPr>
+          <w:rFonts w:ascii="Times New Roman" w:eastAsia="Times New Roman" w:hAnsi="Times New Roman" w:cs="Times New Roman"/>
+          <w:i/>
+          <w:iCs/>
+          <w:color w:val="000000" w:themeColor="text1"/>
+        </w:rPr>
+        <w:t xml:space="preserve">US$ 9,500.00</w:t>
+      </w:r>
+    </w:p>
+    <w:p>
+      <w:pPr>
+        <w:spacing w:before="100" w:after="240" w:line="240" w:lineRule="auto"/>
+        <w:ind w:left="3540"/>
+        <w:rPr>
+          <w:rFonts w:ascii="Times New Roman" w:eastAsia="Times New Roman" w:hAnsi="Times New Roman" w:cs="Times New Roman"/>
+          <w:color w:val="000000" w:themeColor="text1"/>
+        </w:rPr>
+      </w:pPr>
+      <w:r>
+        <w:rPr>
+          <w:rFonts w:ascii="Times New Roman" w:eastAsia="Times New Roman" w:hAnsi="Times New Roman" w:cs="Times New Roman"/>
+          <w:i/>
+          <w:iCs/>
+          <w:color w:val="000000" w:themeColor="text1"/>
+        </w:rPr>
+        <w:t xml:space="preserve">El detalle se adjunta en el Excel “detalle-gastos-desercion-vehicular.xlsx”.</w:t>
+      </w:r>
+    </w:p>
+    <w:p>
+      <w:pPr>
+        <w:spacing w:before="100" w:after="240" w:line="240" w:lineRule="auto"/>
+        <w:ind w:left="3540"/>
+        <w:rPr>
+          <w:rFonts w:ascii="Times New Roman" w:eastAsia="Times New Roman" w:hAnsi="Times New Roman" w:cs="Times New Roman"/>
+          <w:color w:val="000000" w:themeColor="text1"/>
+        </w:rPr>
+      </w:pPr>
+      <w:r>
+        <w:rPr>
+          <w:rFonts w:ascii="Times New Roman" w:eastAsia="Times New Roman" w:hAnsi="Times New Roman" w:cs="Times New Roman"/>
+          <w:b/>
+          <w:bCs/>
+          <w:i/>
+          <w:iCs/>
+          <w:color w:val="000000" w:themeColor="text1"/>
+        </w:rPr>
+        <w:t xml:space="preserve">MONTO TOTAL: </w:t>
+      </w:r>
+      <w:r>
+        <w:rPr>
+          <w:rFonts w:ascii="Times New Roman" w:eastAsia="Times New Roman" w:hAnsi="Times New Roman" w:cs="Times New Roman"/>
+          <w:b/>
+          <w:bCs/>
+          <w:i/>
+          <w:iCs/>
+          <w:color w:val="000000" w:themeColor="text1"/>
+        </w:rPr>
+        <w:t xml:space="preserve">US$ 27,000.00 + IGV</w:t>
       </w:r>
     </w:p>
     <w:p>
@@ -418,7 +348,7 @@
           <w:iCs/>
           <w:color w:val="000000" w:themeColor="text1"/>
         </w:rPr>
-        <w:t xml:space="preserve">S/ 27,000.00</w:t>
+        <w:t xml:space="preserve">US$ 27,000.00</w:t>
       </w:r>
     </w:p>
     <w:p>
@@ -450,7 +380,7 @@
           <w:iCs/>
           <w:color w:val="000000" w:themeColor="text1"/>
         </w:rPr>
-        <w:t xml:space="preserve">S/ 4,860.00</w:t>
+        <w:t xml:space="preserve">US$ 4,860.00</w:t>
       </w:r>
     </w:p>
     <w:p>
@@ -482,7 +412,7 @@
           <w:iCs/>
           <w:color w:val="000000" w:themeColor="text1"/>
         </w:rPr>
-        <w:t xml:space="preserve">S/ 31,860.00</w:t>
+        <w:t xml:space="preserve">US$ 31,860.00</w:t>
       </w:r>
     </w:p>
     <w:p>
@@ -542,7 +472,7 @@
           <w:iCs/>
           <w:color w:val="000000" w:themeColor="text1"/>
         </w:rPr>
-        <w:t xml:space="preserve">75 días (2.5 meses)</w:t>
+        <w:t xml:space="preserve">Hasta el 31 de diciembre de 2026</w:t>
       </w:r>
     </w:p>
     <w:p>

</xml_diff>

<commit_message>
Fusionar justificacion de la solicitud en un solo texto directo
Co-Authored-By: Claude Opus 5.5 <noreply@anthropic.com>
Claude-Session: https://claude.ai/code/session_01DoHx9ZQNZXcgog7oJGoyRL
</commit_message>
<xml_diff>
--- a/JUSTIFICACION_OC_DESERCION_VEHICULAR.docx
+++ b/JUSTIFICACION_OC_DESERCION_VEHICULAR.docx
@@ -83,24 +83,24 @@
           <w:rFonts w:ascii="Times New Roman" w:eastAsia="Times New Roman" w:hAnsi="Times New Roman" w:cs="Times New Roman"/>
           <w:color w:val="000000" w:themeColor="text1"/>
         </w:rPr>
-        <w:t xml:space="preserve"> por US$ 27,000.00 + IGV, para cubrir los gastos de la iniciativa de deserción vehicular de Cálidda hasta el cierre del año 2026.</w:t>
-      </w:r>
-    </w:p>
-    <w:p>
-      <w:pPr>
-        <w:spacing w:before="100" w:after="240" w:line="240" w:lineRule="auto"/>
-        <w:ind w:left="3540"/>
-        <w:rPr>
-          <w:rFonts w:ascii="Times New Roman" w:eastAsia="Times New Roman" w:hAnsi="Times New Roman" w:cs="Times New Roman"/>
-          <w:color w:val="000000" w:themeColor="text1"/>
-        </w:rPr>
-      </w:pPr>
-      <w:r>
-        <w:rPr>
-          <w:rFonts w:ascii="Times New Roman" w:eastAsia="Times New Roman" w:hAnsi="Times New Roman" w:cs="Times New Roman"/>
-          <w:color w:val="000000" w:themeColor="text1"/>
-        </w:rPr>
-        <w:t xml:space="preserve">La iniciativa se encuentra en proceso de escalamiento y pasará a su siguiente fase, por lo que se requiere asegurar el presupuesto para su ejecución. El monto cubre, de manera general, los tres gastos de la iniciativa: la plataforma de registros (10,000 registros), el marketing digital y el volanteo en campo. El monto de US$ 27,000.00 es el tope de la ampliación.</w:t>
+        <w:t xml:space="preserve"> por US$ 27,000.00 + IGV (monto tope), para ejecutar la iniciativa de Deserción Vehicular de Cálidda hasta el cierre del año 2026 (aprox. 75 días). La iniciativa se encuentra en proceso de escalamiento hacia su siguiente fase y tiene como objetivo captar y registrar más de 10,000 conductores.</w:t>
+      </w:r>
+    </w:p>
+    <w:p>
+      <w:pPr>
+        <w:spacing w:before="100" w:after="240" w:line="240" w:lineRule="auto"/>
+        <w:ind w:left="3540"/>
+        <w:rPr>
+          <w:rFonts w:ascii="Times New Roman" w:eastAsia="Times New Roman" w:hAnsi="Times New Roman" w:cs="Times New Roman"/>
+          <w:color w:val="000000" w:themeColor="text1"/>
+        </w:rPr>
+      </w:pPr>
+      <w:r>
+        <w:rPr>
+          <w:rFonts w:ascii="Times New Roman" w:eastAsia="Times New Roman" w:hAnsi="Times New Roman" w:cs="Times New Roman"/>
+          <w:color w:val="000000" w:themeColor="text1"/>
+        </w:rPr>
+        <w:t xml:space="preserve">El monto cubre los tres gastos prioritarios de la iniciativa: (1) la plataforma de registros, (2) el marketing digital para generar registros y (3) el volanteo en campo.</w:t>
       </w:r>
     </w:p>
     <w:p>

</xml_diff>

<commit_message>
Dejar la justificacion de la solicitud en un solo parrafo
Co-Authored-By: Claude Opus 5.5 <noreply@anthropic.com>
Claude-Session: https://claude.ai/code/session_01DoHx9ZQNZXcgog7oJGoyRL
</commit_message>
<xml_diff>
--- a/JUSTIFICACION_OC_DESERCION_VEHICULAR.docx
+++ b/JUSTIFICACION_OC_DESERCION_VEHICULAR.docx
@@ -83,24 +83,7 @@
           <w:rFonts w:ascii="Times New Roman" w:eastAsia="Times New Roman" w:hAnsi="Times New Roman" w:cs="Times New Roman"/>
           <w:color w:val="000000" w:themeColor="text1"/>
         </w:rPr>
-        <w:t xml:space="preserve"> por US$ 27,000.00 + IGV (monto tope), para ejecutar la iniciativa de Deserción Vehicular de Cálidda hasta el cierre del año 2026 (aprox. 75 días). La iniciativa se encuentra en proceso de escalamiento hacia su siguiente fase y tiene como objetivo captar y registrar más de 10,000 conductores.</w:t>
-      </w:r>
-    </w:p>
-    <w:p>
-      <w:pPr>
-        <w:spacing w:before="100" w:after="240" w:line="240" w:lineRule="auto"/>
-        <w:ind w:left="3540"/>
-        <w:rPr>
-          <w:rFonts w:ascii="Times New Roman" w:eastAsia="Times New Roman" w:hAnsi="Times New Roman" w:cs="Times New Roman"/>
-          <w:color w:val="000000" w:themeColor="text1"/>
-        </w:rPr>
-      </w:pPr>
-      <w:r>
-        <w:rPr>
-          <w:rFonts w:ascii="Times New Roman" w:eastAsia="Times New Roman" w:hAnsi="Times New Roman" w:cs="Times New Roman"/>
-          <w:color w:val="000000" w:themeColor="text1"/>
-        </w:rPr>
-        <w:t xml:space="preserve">El monto cubre los tres gastos prioritarios de la iniciativa: (1) la plataforma de registros, (2) el marketing digital para generar registros y (3) el volanteo en campo.</w:t>
+        <w:t xml:space="preserve"> por US$ 27,000.00 + IGV (monto tope), para ejecutar la iniciativa de Deserción Vehicular de Cálidda hasta el cierre del año 2026 (aprox. 75 días). La iniciativa se encuentra en proceso de escalamiento hacia su siguiente fase y tiene como objetivo captar y registrar más de 10,000 conductores. El monto cubre los tres gastos prioritarios de la iniciativa: (1) la plataforma de registros, (2) el marketing digital para generar registros y (3) el volanteo en campo.</w:t>
       </w:r>
     </w:p>
     <w:p>

</xml_diff>

<commit_message>
Ajustar montos para que el total incluido IGV sea US$ 27,000
Co-Authored-By: Claude Opus 5.5 <noreply@anthropic.com>
Claude-Session: https://claude.ai/code/session_01DoHx9ZQNZXcgog7oJGoyRL
</commit_message>
<xml_diff>
--- a/JUSTIFICACION_OC_DESERCION_VEHICULAR.docx
+++ b/JUSTIFICACION_OC_DESERCION_VEHICULAR.docx
@@ -83,7 +83,7 @@
           <w:rFonts w:ascii="Times New Roman" w:eastAsia="Times New Roman" w:hAnsi="Times New Roman" w:cs="Times New Roman"/>
           <w:color w:val="000000" w:themeColor="text1"/>
         </w:rPr>
-        <w:t xml:space="preserve"> por US$ 27,000.00 + IGV (monto tope), para ejecutar la iniciativa de Deserción Vehicular de Cálidda hasta el cierre del año 2026 (aprox. 75 días). La iniciativa se encuentra en proceso de escalamiento hacia su siguiente fase y tiene como objetivo captar y registrar más de 10,000 conductores. El monto cubre los tres gastos prioritarios de la iniciativa: (1) la plataforma de registros, (2) el marketing digital para generar registros y (3) el volanteo en campo.</w:t>
+        <w:t xml:space="preserve"> por US$ 27,000.00 incluido IGV (monto tope), para ejecutar la iniciativa de Deserción Vehicular de Cálidda hasta el cierre del año 2026 (aprox. 75 días). La iniciativa se encuentra en proceso de escalamiento hacia su siguiente fase y tiene como objetivo captar y registrar más de 10,000 conductores. El monto cubre los tres gastos prioritarios de la iniciativa: (1) la plataforma de registros, (2) el marketing digital para generar registros y (3) el volanteo en campo.</w:t>
       </w:r>
     </w:p>
     <w:p>
@@ -218,7 +218,7 @@
           <w:iCs/>
           <w:color w:val="000000" w:themeColor="text1"/>
         </w:rPr>
-        <w:t xml:space="preserve">US$ 9,500.00</w:t>
+        <w:t xml:space="preserve">US$ 7,440.68</w:t>
       </w:r>
     </w:p>
     <w:p>
@@ -248,7 +248,7 @@
           <w:iCs/>
           <w:color w:val="000000" w:themeColor="text1"/>
         </w:rPr>
-        <w:t xml:space="preserve">US$ 9,500.00</w:t>
+        <w:t xml:space="preserve">US$ 7,440.68</w:t>
       </w:r>
     </w:p>
     <w:p>
@@ -299,7 +299,7 @@
           <w:iCs/>
           <w:color w:val="000000" w:themeColor="text1"/>
         </w:rPr>
-        <w:t xml:space="preserve">US$ 27,000.00 + IGV</w:t>
+        <w:t xml:space="preserve">US$ 27,000.00 (incluido IGV)</w:t>
       </w:r>
     </w:p>
     <w:p>
@@ -331,71 +331,71 @@
           <w:iCs/>
           <w:color w:val="000000" w:themeColor="text1"/>
         </w:rPr>
+        <w:t xml:space="preserve">US$ 22,881.36</w:t>
+      </w:r>
+    </w:p>
+    <w:p>
+      <w:pPr>
+        <w:spacing w:after="0" w:line="240" w:lineRule="auto"/>
+        <w:ind w:left="3540"/>
+        <w:rPr>
+          <w:rFonts w:ascii="Times New Roman" w:eastAsia="Times New Roman" w:hAnsi="Times New Roman" w:cs="Times New Roman"/>
+          <w:color w:val="000000" w:themeColor="text1"/>
+        </w:rPr>
+      </w:pPr>
+      <w:r>
+        <w:rPr>
+          <w:rFonts w:ascii="Times New Roman" w:eastAsia="Times New Roman" w:hAnsi="Times New Roman" w:cs="Times New Roman"/>
+          <w:b/>
+          <w:bCs/>
+          <w:i/>
+          <w:iCs/>
+          <w:color w:val="000000" w:themeColor="text1"/>
+        </w:rPr>
+        <w:t xml:space="preserve">18% IGV: </w:t>
+      </w:r>
+      <w:r>
+        <w:rPr>
+          <w:rFonts w:ascii="Times New Roman" w:eastAsia="Times New Roman" w:hAnsi="Times New Roman" w:cs="Times New Roman"/>
+          <w:b/>
+          <w:bCs/>
+          <w:i/>
+          <w:iCs/>
+          <w:color w:val="000000" w:themeColor="text1"/>
+        </w:rPr>
+        <w:t xml:space="preserve">US$ 4,118.64</w:t>
+      </w:r>
+    </w:p>
+    <w:p>
+      <w:pPr>
+        <w:spacing w:after="0" w:line="240" w:lineRule="auto"/>
+        <w:ind w:left="3540"/>
+        <w:rPr>
+          <w:rFonts w:ascii="Times New Roman" w:eastAsia="Times New Roman" w:hAnsi="Times New Roman" w:cs="Times New Roman"/>
+          <w:color w:val="000000" w:themeColor="text1"/>
+        </w:rPr>
+      </w:pPr>
+      <w:r>
+        <w:rPr>
+          <w:rFonts w:ascii="Times New Roman" w:eastAsia="Times New Roman" w:hAnsi="Times New Roman" w:cs="Times New Roman"/>
+          <w:b/>
+          <w:bCs/>
+          <w:i/>
+          <w:iCs/>
+          <w:color w:val="000000" w:themeColor="text1"/>
+        </w:rPr>
+        <w:t xml:space="preserve">TOTAL INCLUIDO IGV: </w:t>
+      </w:r>
+      <w:r>
+        <w:rPr>
+          <w:rFonts w:ascii="Times New Roman" w:eastAsia="Times New Roman" w:hAnsi="Times New Roman" w:cs="Times New Roman"/>
+          <w:b/>
+          <w:bCs/>
+          <w:i/>
+          <w:iCs/>
+          <w:color w:val="000000" w:themeColor="text1"/>
+        </w:rPr>
         <w:t xml:space="preserve">US$ 27,000.00</w:t>
-      </w:r>
-    </w:p>
-    <w:p>
-      <w:pPr>
-        <w:spacing w:after="0" w:line="240" w:lineRule="auto"/>
-        <w:ind w:left="3540"/>
-        <w:rPr>
-          <w:rFonts w:ascii="Times New Roman" w:eastAsia="Times New Roman" w:hAnsi="Times New Roman" w:cs="Times New Roman"/>
-          <w:color w:val="000000" w:themeColor="text1"/>
-        </w:rPr>
-      </w:pPr>
-      <w:r>
-        <w:rPr>
-          <w:rFonts w:ascii="Times New Roman" w:eastAsia="Times New Roman" w:hAnsi="Times New Roman" w:cs="Times New Roman"/>
-          <w:b/>
-          <w:bCs/>
-          <w:i/>
-          <w:iCs/>
-          <w:color w:val="000000" w:themeColor="text1"/>
-        </w:rPr>
-        <w:t xml:space="preserve">18% IGV: </w:t>
-      </w:r>
-      <w:r>
-        <w:rPr>
-          <w:rFonts w:ascii="Times New Roman" w:eastAsia="Times New Roman" w:hAnsi="Times New Roman" w:cs="Times New Roman"/>
-          <w:b/>
-          <w:bCs/>
-          <w:i/>
-          <w:iCs/>
-          <w:color w:val="000000" w:themeColor="text1"/>
-        </w:rPr>
-        <w:t xml:space="preserve">US$ 4,860.00</w:t>
-      </w:r>
-    </w:p>
-    <w:p>
-      <w:pPr>
-        <w:spacing w:after="0" w:line="240" w:lineRule="auto"/>
-        <w:ind w:left="3540"/>
-        <w:rPr>
-          <w:rFonts w:ascii="Times New Roman" w:eastAsia="Times New Roman" w:hAnsi="Times New Roman" w:cs="Times New Roman"/>
-          <w:color w:val="000000" w:themeColor="text1"/>
-        </w:rPr>
-      </w:pPr>
-      <w:r>
-        <w:rPr>
-          <w:rFonts w:ascii="Times New Roman" w:eastAsia="Times New Roman" w:hAnsi="Times New Roman" w:cs="Times New Roman"/>
-          <w:b/>
-          <w:bCs/>
-          <w:i/>
-          <w:iCs/>
-          <w:color w:val="000000" w:themeColor="text1"/>
-        </w:rPr>
-        <w:t xml:space="preserve">TOTAL INCLUIDO IGV: </w:t>
-      </w:r>
-      <w:r>
-        <w:rPr>
-          <w:rFonts w:ascii="Times New Roman" w:eastAsia="Times New Roman" w:hAnsi="Times New Roman" w:cs="Times New Roman"/>
-          <w:b/>
-          <w:bCs/>
-          <w:i/>
-          <w:iCs/>
-          <w:color w:val="000000" w:themeColor="text1"/>
-        </w:rPr>
-        <w:t xml:space="preserve">US$ 31,860.00</w:t>
       </w:r>
     </w:p>
     <w:p>

</xml_diff>